<commit_message>
Update slichot to print after Gedaliah
</commit_message>
<xml_diff>
--- a/emptySched.docx
+++ b/emptySched.docx
@@ -2,10 +2,78 @@
 <file path=word/document.xml><?xml version="1.0" encoding="utf-8"?>
 <w:document xmlns:wpc="http://schemas.microsoft.com/office/word/2010/wordprocessingCanvas" xmlns:cx="http://schemas.microsoft.com/office/drawing/2014/chartex" xmlns:cx1="http://schemas.microsoft.com/office/drawing/2015/9/8/chartex" xmlns:cx2="http://schemas.microsoft.com/office/drawing/2015/10/21/chartex" xmlns:cx3="http://schemas.microsoft.com/office/drawing/2016/5/9/chartex" xmlns:cx4="http://schemas.microsoft.com/office/drawing/2016/5/10/chartex" xmlns:cx5="http://schemas.microsoft.com/office/drawing/2016/5/11/chartex" xmlns:cx6="http://schemas.microsoft.com/office/drawing/2016/5/12/chartex" xmlns:cx7="http://schemas.microsoft.com/office/drawing/2016/5/13/chartex" xmlns:cx8="http://schemas.microsoft.com/office/drawing/2016/5/14/chartex" xmlns:mc="http://schemas.openxmlformats.org/markup-compatibility/2006" xmlns:m="http://schemas.openxmlformats.org/officeDocument/2006/math" xmlns:aink="http://schemas.microsoft.com/office/drawing/2016/ink" xmlns:am3d="http://schemas.microsoft.com/office/drawing/2017/model3d" xmlns:oel="http://schemas.microsoft.com/office/2019/extlst" xmlns:r="http://schemas.openxmlformats.org/officeDocument/2006/relationships" xmlns:wp14="http://schemas.microsoft.com/office/word/2010/wordprocessingDrawing" xmlns:wp="http://schemas.openxmlformats.org/drawingml/2006/wordprocessingDrawing" xmlns:wpg="http://schemas.microsoft.com/office/word/2010/wordprocessingGroup" xmlns:wpi="http://schemas.microsoft.com/office/word/2010/wordprocessingInk" xmlns:wps="http://schemas.microsoft.com/office/word/2010/wordprocessingShape" xmlns:o="urn:schemas-microsoft-com:office:office" xmlns:v="urn:schemas-microsoft-com:vml" xmlns:w10="urn:schemas-microsoft-com:office:word" xmlns:w="http://schemas.openxmlformats.org/wordprocessingml/2006/main" xmlns:w14="http://schemas.microsoft.com/office/word/2010/wordml" xmlns:w15="http://schemas.microsoft.com/office/word/2012/wordml" xmlns:w16cex="http://schemas.microsoft.com/office/word/2018/wordml/cex" xmlns:w16cid="http://schemas.microsoft.com/office/word/2016/wordml/cid" xmlns:w16="http://schemas.microsoft.com/office/word/2018/wordml" xmlns:w16sdtdh="http://schemas.microsoft.com/office/word/2020/wordml/sdtdatahash" xmlns:w16sdtfl="http://schemas.microsoft.com/office/word/2024/wordml/sdtformatlock" xmlns:w16se="http://schemas.microsoft.com/office/word/2015/wordml/symex" xmlns:w16du="http://schemas.microsoft.com/office/word/2023/wordml/word16du" xmlns:wne="http://schemas.microsoft.com/office/word/2006/wordml" mc:Ignorable="w14 w15 w16se w16cid w16 w16cex w16sdtdh w16sdtfl w16du wp14">
   <w:body>
-    <w:p/>
+    <w:p>
+      <w:r>
+        <w:rPr>
+          <w:noProof/>
+        </w:rPr>
+        <w:drawing>
+          <wp:anchor distT="0" distB="0" distL="114300" distR="114300" simplePos="0" relativeHeight="251659264" behindDoc="0" locked="0" layoutInCell="1" allowOverlap="1" wp14:anchorId="068B2356" wp14:editId="5412A5C4">
+            <wp:simplePos x="0" y="0"/>
+            <wp:positionH relativeFrom="column">
+              <wp:posOffset>-713938</wp:posOffset>
+            </wp:positionH>
+            <wp:positionV relativeFrom="paragraph">
+              <wp:posOffset>-430030</wp:posOffset>
+            </wp:positionV>
+            <wp:extent cx="1191600" cy="2325600"/>
+            <wp:effectExtent l="0" t="0" r="8890" b="0"/>
+            <wp:wrapNone/>
+            <wp:docPr id="83367308" name="Picture 4"/>
+            <wp:cNvGraphicFramePr>
+              <a:graphicFrameLocks xmlns:a="http://schemas.openxmlformats.org/drawingml/2006/main" noChangeAspect="1"/>
+            </wp:cNvGraphicFramePr>
+            <a:graphic xmlns:a="http://schemas.openxmlformats.org/drawingml/2006/main">
+              <a:graphicData uri="http://schemas.openxmlformats.org/drawingml/2006/picture">
+                <pic:pic xmlns:pic="http://schemas.openxmlformats.org/drawingml/2006/picture">
+                  <pic:nvPicPr>
+                    <pic:cNvPr id="0" name="Picture 6"/>
+                    <pic:cNvPicPr>
+                      <a:picLocks noChangeAspect="1" noChangeArrowheads="1"/>
+                    </pic:cNvPicPr>
+                  </pic:nvPicPr>
+                  <pic:blipFill>
+                    <a:blip r:embed="rId7" cstate="print">
+                      <a:extLst>
+                        <a:ext uri="{28A0092B-C50C-407E-A947-70E740481C1C}">
+                          <a14:useLocalDpi xmlns:a14="http://schemas.microsoft.com/office/drawing/2010/main" val="0"/>
+                        </a:ext>
+                      </a:extLst>
+                    </a:blip>
+                    <a:srcRect/>
+                    <a:stretch>
+                      <a:fillRect/>
+                    </a:stretch>
+                  </pic:blipFill>
+                  <pic:spPr bwMode="auto">
+                    <a:xfrm>
+                      <a:off x="0" y="0"/>
+                      <a:ext cx="1191600" cy="2325600"/>
+                    </a:xfrm>
+                    <a:prstGeom prst="rect">
+                      <a:avLst/>
+                    </a:prstGeom>
+                    <a:noFill/>
+                    <a:ln>
+                      <a:noFill/>
+                    </a:ln>
+                  </pic:spPr>
+                </pic:pic>
+              </a:graphicData>
+            </a:graphic>
+            <wp14:sizeRelH relativeFrom="page">
+              <wp14:pctWidth>0</wp14:pctWidth>
+            </wp14:sizeRelH>
+            <wp14:sizeRelV relativeFrom="page">
+              <wp14:pctHeight>0</wp14:pctHeight>
+            </wp14:sizeRelV>
+          </wp:anchor>
+        </w:drawing>
+      </w:r>
+    </w:p>
     <w:sectPr>
-      <w:headerReference w:type="default" r:id="rId7"/>
-      <w:footerReference w:type="default" r:id="rId8"/>
+      <w:headerReference w:type="default" r:id="rId8"/>
+      <w:footerReference w:type="default" r:id="rId9"/>
       <w:pgSz w:w="11909" w:h="16834" w:code="9"/>
       <w:pgMar w:top="720" w:right="1418" w:bottom="720" w:left="1418" w:header="0" w:footer="567" w:gutter="0"/>
       <w:cols w:space="720"/>
@@ -1969,11 +2037,11 @@
         </mc:Choice>
         <mc:Fallback>
           <w:pict>
-            <v:shapetype id="_x0000_t202" coordsize="21600,21600" o:spt="202" path="m,l,21600r21600,l21600,xe">
+            <v:shapetype w14:anchorId="5546E3D8" id="_x0000_t202" coordsize="21600,21600" o:spt="202" path="m,l,21600r21600,l21600,xe">
               <v:stroke joinstyle="miter"/>
               <v:path gradientshapeok="t" o:connecttype="rect"/>
             </v:shapetype>
-            <v:shape id="Text Box 2" o:spid="_x0000_s1026" type="#_x0000_t202" style="position:absolute;left:0;text-align:left;margin-left:4.05pt;margin-top:-18.35pt;width:6in;height:40.5pt;z-index:251658240;visibility:visible;mso-wrap-style:square;mso-width-percent:0;mso-height-percent:0;mso-wrap-distance-left:9pt;mso-wrap-distance-top:0;mso-wrap-distance-right:9pt;mso-wrap-distance-bottom:0;mso-position-horizontal:absolute;mso-position-horizontal-relative:text;mso-position-vertical:absolute;mso-position-vertical-relative:text;mso-width-percent:0;mso-height-percent:0;mso-width-relative:page;mso-height-relative:page;v-text-anchor:top" o:gfxdata="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" filled="f" stroked="f">
+            <v:shape id="Text Box 2" o:spid="_x0000_s1026" type="#_x0000_t202" style="position:absolute;left:0;text-align:left;margin-left:4.05pt;margin-top:-18.35pt;width:6in;height:40.5pt;z-index:251658240;visibility:visible;mso-wrap-style:square;mso-width-percent:0;mso-height-percent:0;mso-wrap-distance-left:9pt;mso-wrap-distance-top:0;mso-wrap-distance-right:9pt;mso-wrap-distance-bottom:0;mso-position-horizontal:absolute;mso-position-horizontal-relative:text;mso-position-vertical:absolute;mso-position-vertical-relative:text;mso-width-percent:0;mso-height-percent:0;mso-width-relative:page;mso-height-relative:page;v-text-anchor:top" o:gfxdata="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" filled="f" stroked="f">
               <v:textbox>
                 <w:txbxContent>
                   <w:p>
@@ -2148,7 +2216,7 @@
         </mc:Choice>
         <mc:Fallback>
           <w:pict>
-            <v:shape id="Text Box 1" o:spid="_x0000_s1027" type="#_x0000_t202" style="position:absolute;left:0;text-align:left;margin-left:463.05pt;margin-top:-19.1pt;width:36pt;height:27.15pt;z-index:251657216;visibility:visible;mso-wrap-style:square;mso-width-percent:0;mso-height-percent:0;mso-wrap-distance-left:9pt;mso-wrap-distance-top:0;mso-wrap-distance-right:9pt;mso-wrap-distance-bottom:0;mso-position-horizontal:absolute;mso-position-horizontal-relative:text;mso-position-vertical:absolute;mso-position-vertical-relative:text;mso-width-percent:0;mso-height-percent:0;mso-width-relative:page;mso-height-relative:page;v-text-anchor:top" o:gfxdata="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" filled="f" stroked="f">
+            <v:shape w14:anchorId="57C4BEFE" id="Text Box 1" o:spid="_x0000_s1027" type="#_x0000_t202" style="position:absolute;left:0;text-align:left;margin-left:463.05pt;margin-top:-19.1pt;width:36pt;height:27.15pt;z-index:251657216;visibility:visible;mso-wrap-style:square;mso-width-percent:0;mso-height-percent:0;mso-wrap-distance-left:9pt;mso-wrap-distance-top:0;mso-wrap-distance-right:9pt;mso-wrap-distance-bottom:0;mso-position-horizontal:absolute;mso-position-horizontal-relative:text;mso-position-vertical:absolute;mso-position-vertical-relative:text;mso-width-percent:0;mso-height-percent:0;mso-width-relative:page;mso-height-relative:page;v-text-anchor:top" o:gfxdata="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" filled="f" stroked="f">
               <v:textbox>
                 <w:txbxContent>
                   <w:p>

</xml_diff>